<commit_message>
Fix all placeholder metrics in coursework reports
Both coursework_report.md and DG4NLP_Coursework_Report.docx updated
with the real experimental results from pipeline_metrics.json:

  Before (placeholder)    After (actual)
  LinearSVC 85.3%      -> Logistic Regression 85.02%
  ZSC 68.4%            -> 35.0%
  Macro-F1 81.4        -> 75.26  (classical ML)
  Macro-F1 61.2        -> 16.3   (ZSC)
  BART ROUGE-1 32.4    -> 0.1834
  BART ROUGE-L 28.8    -> 0.1625
  RAG ROUGE-1 35.1     -> 0.2055
  RAG ROUGE-L 31.4     -> 0.1743

Also updated best-model claim (LR > LinearSVC by 0.16pp),
added FastAPI/WebSocket chatbot to Section 4 narrative,
and corrected the RAG improvement figure (+12.1% ROUGE-1).

Co-Authored-By: Claude Sonnet 4.6 <noreply@anthropic.com>
</commit_message>
<xml_diff>
--- a/DG4NLP_Coursework_Report.docx
+++ b/DG4NLP_Coursework_Report.docx
@@ -615,7 +615,7 @@
           <w:sz w:val="22"/>
           <w:szCs w:val="22"/>
         </w:rPr>
-        <w:t xml:space="preserve"> TF-IDF feature extraction, three classifiers (Logistic Regression, Naive Bayes, LinearSVC) achieving up to 85.3% accuracy, plus TF-IDF extractive summarisation.</w:t>
+        <w:t xml:space="preserve"> TF-IDF feature extraction, three classifiers (Logistic Regression, Naive Bayes, LinearSVC) — best: Logistic Regression at 85.02% accuracy — plus TF-IDF extractive summarisation.</w:t>
       </w:r>
     </w:p>
     <w:p>
@@ -740,7 +740,7 @@
           <w:sz w:val="22"/>
           <w:szCs w:val="22"/>
         </w:rPr>
-        <w:t xml:space="preserve">LinearSVC achieves 85.3% accuracy on ArXiv category classification. RAG-augmented summarisation scores ROUGE-1: 35.1, outperforming vanilla BART-CNN by +2.7 points.</w:t>
+        <w:t xml:space="preserve">Logistic Regression achieves 85.02% accuracy on ArXiv category classification. RAG-augmented summarisation scores ROUGE-1: 0.2055, outperforming vanilla BART-CNN by +12.1% (ROUGE-1).</w:t>
       </w:r>
     </w:p>
     <w:p>
@@ -2823,7 +2823,7 @@
                 <w:sz w:val="20"/>
                 <w:szCs w:val="20"/>
               </w:rPr>
-              <w:t xml:space="preserve">85.3%</w:t>
+              <w:t xml:space="preserve">85.02%</w:t>
             </w:r>
           </w:p>
         </w:tc>
@@ -2860,7 +2860,7 @@
                 <w:sz w:val="20"/>
                 <w:szCs w:val="20"/>
               </w:rPr>
-              <w:t xml:space="preserve">81.4</w:t>
+              <w:t xml:space="preserve">75.26</w:t>
             </w:r>
           </w:p>
         </w:tc>
@@ -3362,7 +3362,7 @@
           <w:sz w:val="22"/>
           <w:szCs w:val="22"/>
         </w:rPr>
-        <w:t xml:space="preserve">Result: 68.4% accuracy | 61.2 Macro-F1</w:t>
+        <w:t xml:space="preserve">Result: 35.0% accuracy | 16.3 Macro-F1</w:t>
       </w:r>
     </w:p>
     <w:p>
@@ -3505,7 +3505,7 @@
           <w:sz w:val="22"/>
           <w:szCs w:val="22"/>
         </w:rPr>
-        <w:t xml:space="preserve">Results: ROUGE-1: 32.4 | ROUGE-L: 28.8</w:t>
+        <w:t xml:space="preserve">Results: ROUGE-1: 0.1834 | ROUGE-L: 0.1625</w:t>
       </w:r>
     </w:p>
     <w:p>
@@ -3727,7 +3727,7 @@
           <w:sz w:val="22"/>
           <w:szCs w:val="22"/>
         </w:rPr>
-        <w:t xml:space="preserve">RAG-augmented generation achieves ROUGE-1: 35.1 and ROUGE-L: 31.4, a significant +2.7 ROUGE-1 improvement over vanilla BART-CNN. The context titles provide localised domain vocabulary unavailable in the model's original news-domain training.</w:t>
+        <w:t xml:space="preserve">RAG-augmented generation achieves ROUGE-1: 0.2055 and ROUGE-L: 0.1743, a +12.1% ROUGE-1 improvement over vanilla BART-CNN. The context titles provide localised domain vocabulary unavailable in the model's original news-domain training.</w:t>
       </w:r>
     </w:p>
     <w:p>
@@ -4022,7 +4022,7 @@
                 <w:sz w:val="20"/>
                 <w:szCs w:val="20"/>
               </w:rPr>
-              <w:t xml:space="preserve">85.3%</w:t>
+              <w:t xml:space="preserve">85.02%</w:t>
             </w:r>
           </w:p>
         </w:tc>
@@ -4059,7 +4059,7 @@
                 <w:sz w:val="20"/>
                 <w:szCs w:val="20"/>
               </w:rPr>
-              <w:t xml:space="preserve">81.4</w:t>
+              <w:t xml:space="preserve">75.26</w:t>
             </w:r>
           </w:p>
         </w:tc>
@@ -4169,7 +4169,7 @@
                 <w:sz w:val="20"/>
                 <w:szCs w:val="20"/>
               </w:rPr>
-              <w:t xml:space="preserve">68.4%</w:t>
+              <w:t xml:space="preserve">35.0%</w:t>
             </w:r>
           </w:p>
         </w:tc>
@@ -4206,7 +4206,7 @@
                 <w:sz w:val="20"/>
                 <w:szCs w:val="20"/>
               </w:rPr>
-              <w:t xml:space="preserve">61.2</w:t>
+              <w:t xml:space="preserve">16.3</w:t>
             </w:r>
           </w:p>
         </w:tc>
@@ -4688,7 +4688,7 @@
                 <w:sz w:val="20"/>
                 <w:szCs w:val="20"/>
               </w:rPr>
-              <w:t xml:space="preserve">32.4</w:t>
+              <w:t xml:space="preserve">0.1834</w:t>
             </w:r>
           </w:p>
         </w:tc>
@@ -4725,7 +4725,7 @@
                 <w:sz w:val="20"/>
                 <w:szCs w:val="20"/>
               </w:rPr>
-              <w:t xml:space="preserve">28.8</w:t>
+              <w:t xml:space="preserve">0.1625</w:t>
             </w:r>
           </w:p>
         </w:tc>
@@ -4835,7 +4835,7 @@
                 <w:sz w:val="20"/>
                 <w:szCs w:val="20"/>
               </w:rPr>
-              <w:t xml:space="preserve">35.1</w:t>
+              <w:t xml:space="preserve">0.2055</w:t>
             </w:r>
           </w:p>
         </w:tc>
@@ -4872,7 +4872,7 @@
                 <w:sz w:val="20"/>
                 <w:szCs w:val="20"/>
               </w:rPr>
-              <w:t xml:space="preserve">31.4</w:t>
+              <w:t xml:space="preserve">0.1743</w:t>
             </w:r>
           </w:p>
         </w:tc>
@@ -7911,7 +7911,7 @@
                 <w:sz w:val="20"/>
                 <w:szCs w:val="20"/>
               </w:rPr>
-              <w:t xml:space="preserve">85.3%</w:t>
+              <w:t xml:space="preserve">85.02%</w:t>
             </w:r>
           </w:p>
         </w:tc>
@@ -7948,7 +7948,7 @@
                 <w:sz w:val="20"/>
                 <w:szCs w:val="20"/>
               </w:rPr>
-              <w:t xml:space="preserve">68.4%</w:t>
+              <w:t xml:space="preserve">35.0%</w:t>
             </w:r>
           </w:p>
         </w:tc>
@@ -8132,7 +8132,7 @@
                 <w:sz w:val="20"/>
                 <w:szCs w:val="20"/>
               </w:rPr>
-              <w:t xml:space="preserve">81.4</w:t>
+              <w:t xml:space="preserve">75.26</w:t>
             </w:r>
           </w:p>
         </w:tc>
@@ -8169,7 +8169,7 @@
                 <w:sz w:val="20"/>
                 <w:szCs w:val="20"/>
               </w:rPr>
-              <w:t xml:space="preserve">61.2</w:t>
+              <w:t xml:space="preserve">16.3</w:t>
             </w:r>
           </w:p>
         </w:tc>
@@ -8427,7 +8427,7 @@
                 <w:sz w:val="20"/>
                 <w:szCs w:val="20"/>
               </w:rPr>
-              <w:t xml:space="preserve">32.4</w:t>
+              <w:t xml:space="preserve">0.1834</w:t>
             </w:r>
           </w:p>
         </w:tc>
@@ -8464,7 +8464,7 @@
                 <w:sz w:val="20"/>
                 <w:szCs w:val="20"/>
               </w:rPr>
-              <w:t xml:space="preserve">35.1</w:t>
+              <w:t xml:space="preserve">0.2055</w:t>
             </w:r>
           </w:p>
         </w:tc>
@@ -8648,7 +8648,7 @@
                 <w:sz w:val="20"/>
                 <w:szCs w:val="20"/>
               </w:rPr>
-              <w:t xml:space="preserve">28.8</w:t>
+              <w:t xml:space="preserve">0.1625</w:t>
             </w:r>
           </w:p>
         </w:tc>
@@ -8685,7 +8685,7 @@
                 <w:sz w:val="20"/>
                 <w:szCs w:val="20"/>
               </w:rPr>
-              <w:t xml:space="preserve">31.4</w:t>
+              <w:t xml:space="preserve">0.1743</w:t>
             </w:r>
           </w:p>
         </w:tc>
@@ -9866,7 +9866,7 @@
           <w:sz w:val="22"/>
           <w:szCs w:val="22"/>
         </w:rPr>
-        <w:t xml:space="preserve">The TF-IDF + LinearSVC pipeline is lightweight, fast, and achieves 85.3% accuracy with minimal engineering effort.</w:t>
+        <w:t xml:space="preserve">The TF-IDF + Logistic Regression pipeline is lightweight, fast, and achieves 85.02% accuracy with minimal engineering effort.</w:t>
       </w:r>
     </w:p>
     <w:p>

</xml_diff>